<commit_message>
Complete E1-E9 submission pipeline: reports, answer sheet, PDF, and B-roll.
Add spatial-to-stats evidence, report tooling (word count, stats verify, official answer sheet fill, PDF export, histogram GIF), and refresh submission deliverables.

Co-authored-by: Cursor <cursoragent@cursor.com>
</commit_message>
<xml_diff>
--- a/docs/report/Nyx_Submission.docx
+++ b/docs/report/Nyx_Submission.docx
@@ -41,7 +41,7 @@
         <w:pStyle w:val="ListBullet"/>
       </w:pPr>
       <w:r>
-        <w:t>**渲染**：基于 vtk.js 的 GPU 光线投射体渲染；传递函数采用宇宙学预设 `cosmic`——低密度空洞区近透明，纤维结构紫青，高密度节点金黄；双光源（主光 + 冷色补光），交互模式采样距离 2.2，可选高质量模式采样 1.0 并开启 Phong 着色。</w:t>
+        <w:t>**渲染**：基于 vtk.js 的 GPU 光线投射体渲染；传递函数采用宇宙学预设 `cosmic`（log 域、全局 p01–p99）；展板质量采样 + Phong 着色；五帧由 Playwright 截取。</w:t>
       </w:r>
     </w:p>
     <w:p>
@@ -130,6 +130,30 @@
       </w:pPr>
       <w:r>
         <w:t>t=99: mean=9.3187, σ=0.4983, p99=10.7601, max=14.4494</w:t>
+      </w:r>
+    </w:p>
+    <w:p>
+      <w:pPr>
+        <w:pStyle w:val="Heading1"/>
+      </w:pPr>
+      <w:r>
+        <w:t>工具与环境</w:t>
+      </w:r>
+    </w:p>
+    <w:p>
+      <w:pPr>
+        <w:pStyle w:val="ListBullet"/>
+      </w:pPr>
+      <w:r>
+        <w:t>**本任务**：vtk.js 体渲染 + cosmic 传递函数；静态条带与单帧图由 `generate_figures.py` 排版，体渲染帧由 Playwright 生成。</w:t>
+      </w:r>
+    </w:p>
+    <w:p>
+      <w:pPr>
+        <w:pStyle w:val="ListBullet"/>
+      </w:pPr>
+      <w:r>
+        <w:t>**通用栈**：Vite + React + TypeScript；**vtk.js** 体渲染；**D3.js** 统计图表；Python（`tools/python/precompute.py`、`generate_figures.py`、`viz_style.py`）预计算与 matplotlib 配图；**Playwright**（`tools/node/capture_volumes.mjs`）1920×1080 体渲染截图；`export_report.py` / `export_docx.py` 报告导出；`npm run submission-pack` 一键交付。</w:t>
       </w:r>
     </w:p>
     <w:p>
@@ -314,6 +338,38 @@
         <w:pStyle w:val="Heading1"/>
       </w:pPr>
       <w:r>
+        <w:t>数据与物理背景</w:t>
+      </w:r>
+    </w:p>
+    <w:p>
+      <w:pPr>
+        <w:pStyle w:val="ListBullet"/>
+      </w:pPr>
+      <w:r>
+        <w:t>本数据集来自 **Nyx** 宇宙学模拟：基于 **AMReX** 自适应网格框架的引力流体计算，追踪高红移宇宙中**星系际介质（IGM）**气体密度随时间的演化。</w:t>
+      </w:r>
+    </w:p>
+    <w:p>
+      <w:pPr>
+        <w:pStyle w:val="ListBullet"/>
+      </w:pPr>
+      <w:r>
+        <w:t>128³ 子体积记录的是**重子气体密度**（非暗物质）；100 个时间步对应引力不稳定下，由近乎均匀微涨落向 **void—filament—node** 宇宙网拓扑分化的典型过程。</w:t>
+      </w:r>
+    </w:p>
+    <w:p>
+      <w:pPr>
+        <w:pStyle w:val="ListBullet"/>
+      </w:pPr>
+      <w:r>
+        <w:t>IGM 密度动态范围大、分布强右偏，故本报告在 log 域统计与可视化；绝大部分体积仍为稀疏 IGM，肉眼可见的亮脊/节点对应极少数高密度尾。</w:t>
+      </w:r>
+    </w:p>
+    <w:p>
+      <w:pPr>
+        <w:pStyle w:val="Heading1"/>
+      </w:pPr>
+      <w:r>
         <w:t>结构形成（团块化）</w:t>
       </w:r>
     </w:p>
@@ -402,6 +458,30 @@
     <w:p>
       <w:r>
         <w:t>3. 宇宙网对应：Top 1% 空间投影呈丝状聚集，与体渲染亮脊位置一致（任务四验证）。</w:t>
+      </w:r>
+    </w:p>
+    <w:p>
+      <w:pPr>
+        <w:pStyle w:val="Heading1"/>
+      </w:pPr>
+      <w:r>
+        <w:t>工具与环境</w:t>
+      </w:r>
+    </w:p>
+    <w:p>
+      <w:pPr>
+        <w:pStyle w:val="ListBullet"/>
+      </w:pPr>
+      <w:r>
+        <w:t>**本任务**：`precompute.py` 百步全域统计；`generate_figures.py` 绘制 task2 四联演化曲线（matplotlib + cosmic 主题）。</w:t>
+      </w:r>
+    </w:p>
+    <w:p>
+      <w:pPr>
+        <w:pStyle w:val="ListBullet"/>
+      </w:pPr>
+      <w:r>
+        <w:t>**通用栈**：Vite + React + TypeScript；**vtk.js** 体渲染；**D3.js** 统计图表；Python（`tools/python/precompute.py`、`generate_figures.py`、`viz_style.py`）预计算与 matplotlib 配图；**Playwright**（`tools/node/capture_volumes.mjs`）1920×1080 体渲染截图；`export_report.py` / `export_docx.py` 报告导出；`npm run submission-pack` 一键交付。</w:t>
       </w:r>
     </w:p>
     <w:p>
@@ -663,6 +743,30 @@
         <w:pStyle w:val="Heading1"/>
       </w:pPr>
       <w:r>
+        <w:t>工具与环境</w:t>
+      </w:r>
+    </w:p>
+    <w:p>
+      <w:pPr>
+        <w:pStyle w:val="ListBullet"/>
+      </w:pPr>
+      <w:r>
+        <w:t>**本任务**：`precompute.py` 生成 128-bin log 直方图与 `timeline.json`；静态曲线/叠加图由 `generate_figures.py` 输出；交互页 **D3.js** 直方图与时序图与成果页一致。</w:t>
+      </w:r>
+    </w:p>
+    <w:p>
+      <w:pPr>
+        <w:pStyle w:val="ListBullet"/>
+      </w:pPr>
+      <w:r>
+        <w:t>**通用栈**：Vite + React + TypeScript；**vtk.js** 体渲染；**D3.js** 统计图表；Python（`tools/python/precompute.py`、`generate_figures.py`、`viz_style.py`）预计算与 matplotlib 配图；**Playwright**（`tools/node/capture_volumes.mjs`）1920×1080 体渲染截图；`export_report.py` / `export_docx.py` 报告导出；`npm run submission-pack` 一键交付。</w:t>
+      </w:r>
+    </w:p>
+    <w:p>
+      <w:pPr>
+        <w:pStyle w:val="Heading1"/>
+      </w:pPr>
+      <w:r>
         <w:t>配图</w:t>
       </w:r>
     </w:p>
@@ -791,6 +895,47 @@
     </w:p>
     <w:p>
       <w:r>
+        <w:t>task3_peak_drift</w:t>
+      </w:r>
+    </w:p>
+    <w:p>
+      <w:r>
+        <w:drawing>
+          <wp:inline xmlns:a="http://schemas.openxmlformats.org/drawingml/2006/main" xmlns:pic="http://schemas.openxmlformats.org/drawingml/2006/picture">
+            <wp:extent cx="5400000" cy="2362500"/>
+            <wp:docPr id="12" name="Picture 12"/>
+            <wp:cNvGraphicFramePr>
+              <a:graphicFrameLocks noChangeAspect="1"/>
+            </wp:cNvGraphicFramePr>
+            <a:graphic>
+              <a:graphicData uri="http://schemas.openxmlformats.org/drawingml/2006/picture">
+                <pic:pic>
+                  <pic:nvPicPr>
+                    <pic:cNvPr id="0" name="task3_peak_drift.png"/>
+                    <pic:cNvPicPr/>
+                  </pic:nvPicPr>
+                  <pic:blipFill>
+                    <a:blip r:embed="rId17"/>
+                    <a:stretch>
+                      <a:fillRect/>
+                    </a:stretch>
+                  </pic:blipFill>
+                  <pic:spPr>
+                    <a:xfrm>
+                      <a:off x="0" y="0"/>
+                      <a:ext cx="5400000" cy="2362500"/>
+                    </a:xfrm>
+                    <a:prstGeom prst="rect"/>
+                  </pic:spPr>
+                </pic:pic>
+              </a:graphicData>
+            </a:graphic>
+          </wp:inline>
+        </w:drawing>
+      </w:r>
+    </w:p>
+    <w:p>
+      <w:r>
         <w:t># 任务四：相空间交互刷选可视分析</w:t>
       </w:r>
     </w:p>
@@ -855,6 +1000,38 @@
         <w:pStyle w:val="Heading1"/>
       </w:pPr>
       <w:r>
+        <w:t>验证：空间 → 统计</w:t>
+      </w:r>
+    </w:p>
+    <w:p>
+      <w:pPr>
+        <w:pStyle w:val="ListBullet"/>
+      </w:pPr>
+      <w:r>
+        <w:t>在 t=99 **XY 最大密度投影**上识别 **filament 亮脊**（投影值 ≥ P88 的像素，金色叠加）。</w:t>
+      </w:r>
+    </w:p>
+    <w:p>
+      <w:pPr>
+        <w:pStyle w:val="ListBullet"/>
+      </w:pPr>
+      <w:r>
+        <w:t>汇总这些亮脊像素的密度，得到对应区间 **ρ∈[11.23, 12.16]**（位于 p75–p99 右尾，与 Top 1% 刷选区间一致）。</w:t>
+      </w:r>
+    </w:p>
+    <w:p>
+      <w:pPr>
+        <w:pStyle w:val="ListBullet"/>
+      </w:pPr>
+      <w:r>
+        <w:t>在 log 直方图上以金色标注该密度带 → **空间结构可反查统计位置**，与 `/app.html` 中「先在投影/体渲染定位 filament，再在直方图标密度带」的交互路径一致。</w:t>
+      </w:r>
+    </w:p>
+    <w:p>
+      <w:pPr>
+        <w:pStyle w:val="Heading1"/>
+      </w:pPr>
+      <w:r>
         <w:t>双向关联</w:t>
       </w:r>
     </w:p>
@@ -863,7 +1040,7 @@
         <w:pStyle w:val="ListBullet"/>
       </w:pPr>
       <w:r>
-        <w:t>**统计→空间**：框选 [ρ_min, ρ_max] 定位满足条件的体素集合；</w:t>
+        <w:t>**统计→空间**：框选 [ρ_min, ρ_max] 定位满足条件的体素集合（见 Top/Bottom 1% 三联图）。</w:t>
       </w:r>
     </w:p>
     <w:p>
@@ -871,7 +1048,31 @@
         <w:pStyle w:val="ListBullet"/>
       </w:pPr>
       <w:r>
-        <w:t>**空间→统计**：在体渲染/投影中识别 filament 后，可在直方图上标出对应密度带（见代表步直方图标注）。</w:t>
+        <w:t>**空间→统计**：在投影中识别 filament 亮脊后，反推密度带 ρ∈[11.23, 12.16] 并在直方图高亮（见 `task4_spatial_to_stats.png`，由 `spatial_to_stats.py` 与 `generate_figures.py` 可复现）。</w:t>
+      </w:r>
+    </w:p>
+    <w:p>
+      <w:pPr>
+        <w:pStyle w:val="Heading1"/>
+      </w:pPr>
+      <w:r>
+        <w:t>工具与环境</w:t>
+      </w:r>
+    </w:p>
+    <w:p>
+      <w:pPr>
+        <w:pStyle w:val="ListBullet"/>
+      </w:pPr>
+      <w:r>
+        <w:t>**本任务**：**D3.js** 直方图框选 + **vtk.js** 刷选高亮 + Canvas 2D 最大密度投影（与体渲染同色标）；刷选体素扫描在 **Web Worker**；静态三联图与空间→统计配图由 `generate_figures.py` / `projection_render.py` / `spatial_to_stats.py` 生成。</w:t>
+      </w:r>
+    </w:p>
+    <w:p>
+      <w:pPr>
+        <w:pStyle w:val="ListBullet"/>
+      </w:pPr>
+      <w:r>
+        <w:t>**通用栈**：Vite + React + TypeScript；**vtk.js** 体渲染；**D3.js** 统计图表；Python（`tools/python/precompute.py`、`generate_figures.py`、`viz_style.py`）预计算与 matplotlib 配图；**Playwright**（`tools/node/capture_volumes.mjs`）1920×1080 体渲染截图；`export_report.py` / `export_docx.py` 报告导出；`npm run submission-pack` 一键交付。</w:t>
       </w:r>
     </w:p>
     <w:p>
@@ -884,6 +1085,47 @@
     </w:p>
     <w:p>
       <w:r>
+        <w:t>task4_spatial_to_stats</w:t>
+      </w:r>
+    </w:p>
+    <w:p>
+      <w:r>
+        <w:drawing>
+          <wp:inline xmlns:a="http://schemas.openxmlformats.org/drawingml/2006/main" xmlns:pic="http://schemas.openxmlformats.org/drawingml/2006/picture">
+            <wp:extent cx="5400000" cy="2067750"/>
+            <wp:docPr id="13" name="Picture 13"/>
+            <wp:cNvGraphicFramePr>
+              <a:graphicFrameLocks noChangeAspect="1"/>
+            </wp:cNvGraphicFramePr>
+            <a:graphic>
+              <a:graphicData uri="http://schemas.openxmlformats.org/drawingml/2006/picture">
+                <pic:pic>
+                  <pic:nvPicPr>
+                    <pic:cNvPr id="0" name="task4_spatial_to_stats.png"/>
+                    <pic:cNvPicPr/>
+                  </pic:nvPicPr>
+                  <pic:blipFill>
+                    <a:blip r:embed="rId18"/>
+                    <a:stretch>
+                      <a:fillRect/>
+                    </a:stretch>
+                  </pic:blipFill>
+                  <pic:spPr>
+                    <a:xfrm>
+                      <a:off x="0" y="0"/>
+                      <a:ext cx="5400000" cy="2067750"/>
+                    </a:xfrm>
+                    <a:prstGeom prst="rect"/>
+                  </pic:spPr>
+                </pic:pic>
+              </a:graphicData>
+            </a:graphic>
+          </wp:inline>
+        </w:drawing>
+      </w:r>
+    </w:p>
+    <w:p>
+      <w:r>
         <w:t>task4_brush_triptych</w:t>
       </w:r>
     </w:p>
@@ -892,7 +1134,7 @@
         <w:drawing>
           <wp:inline xmlns:a="http://schemas.openxmlformats.org/drawingml/2006/main" xmlns:pic="http://schemas.openxmlformats.org/drawingml/2006/picture">
             <wp:extent cx="5400000" cy="1763493"/>
-            <wp:docPr id="12" name="Picture 12"/>
+            <wp:docPr id="14" name="Picture 14"/>
             <wp:cNvGraphicFramePr>
               <a:graphicFrameLocks noChangeAspect="1"/>
             </wp:cNvGraphicFramePr>
@@ -904,7 +1146,7 @@
                     <pic:cNvPicPr/>
                   </pic:nvPicPr>
                   <pic:blipFill>
-                    <a:blip r:embed="rId17"/>
+                    <a:blip r:embed="rId19"/>
                     <a:stretch>
                       <a:fillRect/>
                     </a:stretch>
@@ -933,7 +1175,7 @@
         <w:drawing>
           <wp:inline xmlns:a="http://schemas.openxmlformats.org/drawingml/2006/main" xmlns:pic="http://schemas.openxmlformats.org/drawingml/2006/picture">
             <wp:extent cx="5400000" cy="2700000"/>
-            <wp:docPr id="13" name="Picture 13"/>
+            <wp:docPr id="15" name="Picture 15"/>
             <wp:cNvGraphicFramePr>
               <a:graphicFrameLocks noChangeAspect="1"/>
             </wp:cNvGraphicFramePr>
@@ -945,7 +1187,7 @@
                     <pic:cNvPicPr/>
                   </pic:nvPicPr>
                   <pic:blipFill>
-                    <a:blip r:embed="rId18"/>
+                    <a:blip r:embed="rId20"/>
                     <a:stretch>
                       <a:fillRect/>
                     </a:stretch>
@@ -974,7 +1216,7 @@
         <w:drawing>
           <wp:inline xmlns:a="http://schemas.openxmlformats.org/drawingml/2006/main" xmlns:pic="http://schemas.openxmlformats.org/drawingml/2006/picture">
             <wp:extent cx="5400000" cy="5400000"/>
-            <wp:docPr id="14" name="Picture 14"/>
+            <wp:docPr id="16" name="Picture 16"/>
             <wp:cNvGraphicFramePr>
               <a:graphicFrameLocks noChangeAspect="1"/>
             </wp:cNvGraphicFramePr>
@@ -986,7 +1228,7 @@
                     <pic:cNvPicPr/>
                   </pic:nvPicPr>
                   <pic:blipFill>
-                    <a:blip r:embed="rId19"/>
+                    <a:blip r:embed="rId21"/>
                     <a:stretch>
                       <a:fillRect/>
                     </a:stretch>

</xml_diff>